<commit_message>
Add visual feature grid to the home page
Co-Authored-By: Claude Fable 5.1 <noreply@anthropic.com>
</commit_message>
<xml_diff>
--- a/docs/ReachN-product-document.docx
+++ b/docs/ReachN-product-document.docx
@@ -117,6 +117,32 @@
       <w:r>
         <w:rPr/>
         <w:t xml:space="preserve">ReachN gives every employee an NFC business card, a wallet pass, an on-brand email signature and company news to share in one tap. Every contact they meet goes to your CRM. HR runs all of it from one dashboard.</w:t>
+      </w:r>
+    </w:p>
+    <w:p>
+      <w:pPr/>
+      <w:r>
+        <w:rPr>
+          <w:i/>
+          <w:iCs/>
+        </w:rPr>
+        <w:t xml:space="preserve">Ways to share</w:t>
+      </w:r>
+    </w:p>
+    <w:p>
+      <w:pPr>
+        <w:pStyle w:val="Heading4"/>
+      </w:pPr>
+      <w:r>
+        <w:rPr/>
+        <w:t xml:space="preserve">One profile. Shared every way your team works.</w:t>
+      </w:r>
+    </w:p>
+    <w:p>
+      <w:pPr/>
+      <w:r>
+        <w:rPr/>
+        <w:t xml:space="preserve">How an employee shares the card is their choice. How it looks is yours.</w:t>
       </w:r>
     </w:p>
     <w:p>
@@ -4123,6 +4149,42 @@
           <w:rtl/>
         </w:rPr>
         <w:t xml:space="preserve">تمنح ReachN كل موظف بطاقة عمل NFC، وبطاقة في محفظة الجوال، وتوقيع بريد بهوية الشركة، وأخبار الشركة جاهزة للمشاركة بضغطة واحدة. كل شخص يقابله الموظف يُسجَّل في نظام CRM. والموارد البشرية تدير كل ذلك من لوحة واحدة.</w:t>
+      </w:r>
+    </w:p>
+    <w:p>
+      <w:pPr>
+        <w:bidi/>
+      </w:pPr>
+      <w:r>
+        <w:rPr>
+          <w:i/>
+          <w:iCs/>
+          <w:rtl/>
+        </w:rPr>
+        <w:t xml:space="preserve">طرق المشاركة</w:t>
+      </w:r>
+    </w:p>
+    <w:p>
+      <w:pPr>
+        <w:pStyle w:val="Heading4"/>
+        <w:bidi/>
+      </w:pPr>
+      <w:r>
+        <w:rPr>
+          <w:rtl/>
+        </w:rPr>
+        <w:t xml:space="preserve">ملف واحد، يُشارَك بكل طريقة يعمل بها فريقك.</w:t>
+      </w:r>
+    </w:p>
+    <w:p>
+      <w:pPr>
+        <w:bidi/>
+      </w:pPr>
+      <w:r>
+        <w:rPr>
+          <w:rtl/>
+        </w:rPr>
+        <w:t xml:space="preserve">طريقة المشاركة يختارها الموظف. والشكل تحدده أنت.</w:t>
       </w:r>
     </w:p>
     <w:p>

</xml_diff>